<commit_message>
Adiciona relatorio final, integrantes e evidencias reais da pipeline
</commit_message>
<xml_diff>
--- a/docs/AP_II_DevSecOps_TechSecure.docx
+++ b/docs/AP_II_DevSecOps_TechSecure.docx
@@ -568,55 +568,391 @@
     </w:p>
     <w:p>
       <w:r>
-        <w:t>As evidências em imagem devem ser anexadas aqui (prints capturados durante a execução):</w:t>
+        <w:t>Evidências capturadas da execução real da pipeline no GitHub Actions (run 39183655918 — repositório vitoremanuel-lgtm/devsecops-ap2):</w:t>
+      </w:r>
+    </w:p>
+    <w:p>
+      <w:r>
+        <w:drawing>
+          <wp:inline xmlns:a="http://schemas.openxmlformats.org/drawingml/2006/main" xmlns:pic="http://schemas.openxmlformats.org/drawingml/2006/picture">
+            <wp:extent cx="5486400" cy="1980092"/>
+            <wp:docPr id="1" name="Picture 1"/>
+            <wp:cNvGraphicFramePr>
+              <a:graphicFrameLocks noChangeAspect="1"/>
+            </wp:cNvGraphicFramePr>
+            <a:graphic>
+              <a:graphicData uri="http://schemas.openxmlformats.org/drawingml/2006/picture">
+                <pic:pic>
+                  <pic:nvPicPr>
+                    <pic:cNvPr id="0" name="01_pipeline_geral.png"/>
+                    <pic:cNvPicPr/>
+                  </pic:nvPicPr>
+                  <pic:blipFill>
+                    <a:blip r:embed="rId9"/>
+                    <a:stretch>
+                      <a:fillRect/>
+                    </a:stretch>
+                  </pic:blipFill>
+                  <pic:spPr>
+                    <a:xfrm>
+                      <a:off x="0" y="0"/>
+                      <a:ext cx="5486400" cy="1980092"/>
+                    </a:xfrm>
+                    <a:prstGeom prst="rect"/>
+                  </pic:spPr>
+                </pic:pic>
+              </a:graphicData>
+            </a:graphic>
+          </wp:inline>
+        </w:drawing>
       </w:r>
     </w:p>
     <w:p>
       <w:pPr>
-        <w:pStyle w:val="ListBullet"/>
+        <w:jc w:val="center"/>
       </w:pPr>
       <w:r>
-        <w:t>[Print] Pipeline executando no GitHub Actions (jobs verdes)</w:t>
+        <w:rPr>
+          <w:i/>
+          <w:sz w:val="18"/>
+        </w:rPr>
+        <w:t>Figura 1 — Pipeline executada com sucesso (3 jobs verdes).</w:t>
+      </w:r>
+    </w:p>
+    <w:p>
+      <w:r>
+        <w:drawing>
+          <wp:inline xmlns:a="http://schemas.openxmlformats.org/drawingml/2006/main" xmlns:pic="http://schemas.openxmlformats.org/drawingml/2006/picture">
+            <wp:extent cx="5486400" cy="2399053"/>
+            <wp:docPr id="2" name="Picture 2"/>
+            <wp:cNvGraphicFramePr>
+              <a:graphicFrameLocks noChangeAspect="1"/>
+            </wp:cNvGraphicFramePr>
+            <a:graphic>
+              <a:graphicData uri="http://schemas.openxmlformats.org/drawingml/2006/picture">
+                <pic:pic>
+                  <pic:nvPicPr>
+                    <pic:cNvPr id="0" name="02_build_testes.png"/>
+                    <pic:cNvPicPr/>
+                  </pic:nvPicPr>
+                  <pic:blipFill>
+                    <a:blip r:embed="rId10"/>
+                    <a:stretch>
+                      <a:fillRect/>
+                    </a:stretch>
+                  </pic:blipFill>
+                  <pic:spPr>
+                    <a:xfrm>
+                      <a:off x="0" y="0"/>
+                      <a:ext cx="5486400" cy="2399053"/>
+                    </a:xfrm>
+                    <a:prstGeom prst="rect"/>
+                  </pic:spPr>
+                </pic:pic>
+              </a:graphicData>
+            </a:graphic>
+          </wp:inline>
+        </w:drawing>
       </w:r>
     </w:p>
     <w:p>
       <w:pPr>
-        <w:pStyle w:val="ListBullet"/>
+        <w:jc w:val="center"/>
       </w:pPr>
       <w:r>
-        <w:t>[Print] Resultado do build e dos testes</w:t>
+        <w:rPr>
+          <w:i/>
+          <w:sz w:val="18"/>
+        </w:rPr>
+        <w:t>Figura 2 — Build e testes automatizados (5/5, 100% cobertura).</w:t>
+      </w:r>
+    </w:p>
+    <w:p>
+      <w:r>
+        <w:drawing>
+          <wp:inline xmlns:a="http://schemas.openxmlformats.org/drawingml/2006/main" xmlns:pic="http://schemas.openxmlformats.org/drawingml/2006/picture">
+            <wp:extent cx="5486400" cy="1980092"/>
+            <wp:docPr id="3" name="Picture 3"/>
+            <wp:cNvGraphicFramePr>
+              <a:graphicFrameLocks noChangeAspect="1"/>
+            </wp:cNvGraphicFramePr>
+            <a:graphic>
+              <a:graphicData uri="http://schemas.openxmlformats.org/drawingml/2006/picture">
+                <pic:pic>
+                  <pic:nvPicPr>
+                    <pic:cNvPr id="0" name="03_security_npm_audit.png"/>
+                    <pic:cNvPicPr/>
+                  </pic:nvPicPr>
+                  <pic:blipFill>
+                    <a:blip r:embed="rId11"/>
+                    <a:stretch>
+                      <a:fillRect/>
+                    </a:stretch>
+                  </pic:blipFill>
+                  <pic:spPr>
+                    <a:xfrm>
+                      <a:off x="0" y="0"/>
+                      <a:ext cx="5486400" cy="1980092"/>
+                    </a:xfrm>
+                    <a:prstGeom prst="rect"/>
+                  </pic:spPr>
+                </pic:pic>
+              </a:graphicData>
+            </a:graphic>
+          </wp:inline>
+        </w:drawing>
       </w:r>
     </w:p>
     <w:p>
       <w:pPr>
-        <w:pStyle w:val="ListBullet"/>
+        <w:jc w:val="center"/>
       </w:pPr>
       <w:r>
-        <w:t>[Print] Resultado do security scan (npm audit / Trivy)</w:t>
+        <w:rPr>
+          <w:i/>
+          <w:sz w:val="18"/>
+        </w:rPr>
+        <w:t>Figura 3 — Security scan: npm audit (achado braces HIGH).</w:t>
+      </w:r>
+    </w:p>
+    <w:p>
+      <w:r>
+        <w:drawing>
+          <wp:inline xmlns:a="http://schemas.openxmlformats.org/drawingml/2006/main" xmlns:pic="http://schemas.openxmlformats.org/drawingml/2006/picture">
+            <wp:extent cx="5486400" cy="1665871"/>
+            <wp:docPr id="4" name="Picture 4"/>
+            <wp:cNvGraphicFramePr>
+              <a:graphicFrameLocks noChangeAspect="1"/>
+            </wp:cNvGraphicFramePr>
+            <a:graphic>
+              <a:graphicData uri="http://schemas.openxmlformats.org/drawingml/2006/picture">
+                <pic:pic>
+                  <pic:nvPicPr>
+                    <pic:cNvPr id="0" name="04_security_trivy_fs.png"/>
+                    <pic:cNvPicPr/>
+                  </pic:nvPicPr>
+                  <pic:blipFill>
+                    <a:blip r:embed="rId12"/>
+                    <a:stretch>
+                      <a:fillRect/>
+                    </a:stretch>
+                  </pic:blipFill>
+                  <pic:spPr>
+                    <a:xfrm>
+                      <a:off x="0" y="0"/>
+                      <a:ext cx="5486400" cy="1665871"/>
+                    </a:xfrm>
+                    <a:prstGeom prst="rect"/>
+                  </pic:spPr>
+                </pic:pic>
+              </a:graphicData>
+            </a:graphic>
+          </wp:inline>
+        </w:drawing>
       </w:r>
     </w:p>
     <w:p>
       <w:pPr>
-        <w:pStyle w:val="ListBullet"/>
+        <w:jc w:val="center"/>
       </w:pPr>
       <w:r>
-        <w:t>[Print] Build da imagem Docker</w:t>
+        <w:rPr>
+          <w:i/>
+          <w:sz w:val="18"/>
+        </w:rPr>
+        <w:t>Figura 4 — Security scan: Trivy no filesystem.</w:t>
+      </w:r>
+    </w:p>
+    <w:p>
+      <w:r>
+        <w:drawing>
+          <wp:inline xmlns:a="http://schemas.openxmlformats.org/drawingml/2006/main" xmlns:pic="http://schemas.openxmlformats.org/drawingml/2006/picture">
+            <wp:extent cx="5486400" cy="1770611"/>
+            <wp:docPr id="5" name="Picture 5"/>
+            <wp:cNvGraphicFramePr>
+              <a:graphicFrameLocks noChangeAspect="1"/>
+            </wp:cNvGraphicFramePr>
+            <a:graphic>
+              <a:graphicData uri="http://schemas.openxmlformats.org/drawingml/2006/picture">
+                <pic:pic>
+                  <pic:nvPicPr>
+                    <pic:cNvPr id="0" name="05_docker_build.png"/>
+                    <pic:cNvPicPr/>
+                  </pic:nvPicPr>
+                  <pic:blipFill>
+                    <a:blip r:embed="rId13"/>
+                    <a:stretch>
+                      <a:fillRect/>
+                    </a:stretch>
+                  </pic:blipFill>
+                  <pic:spPr>
+                    <a:xfrm>
+                      <a:off x="0" y="0"/>
+                      <a:ext cx="5486400" cy="1770611"/>
+                    </a:xfrm>
+                    <a:prstGeom prst="rect"/>
+                  </pic:spPr>
+                </pic:pic>
+              </a:graphicData>
+            </a:graphic>
+          </wp:inline>
+        </w:drawing>
       </w:r>
     </w:p>
     <w:p>
       <w:pPr>
-        <w:pStyle w:val="ListBullet"/>
+        <w:jc w:val="center"/>
       </w:pPr>
       <w:r>
-        <w:t>[Print] Container em execução (docker ps)</w:t>
+        <w:rPr>
+          <w:i/>
+          <w:sz w:val="18"/>
+        </w:rPr>
+        <w:t>Figura 5 — Build da imagem Docker.</w:t>
+      </w:r>
+    </w:p>
+    <w:p>
+      <w:r>
+        <w:drawing>
+          <wp:inline xmlns:a="http://schemas.openxmlformats.org/drawingml/2006/main" xmlns:pic="http://schemas.openxmlformats.org/drawingml/2006/picture">
+            <wp:extent cx="5486400" cy="1665871"/>
+            <wp:docPr id="6" name="Picture 6"/>
+            <wp:cNvGraphicFramePr>
+              <a:graphicFrameLocks noChangeAspect="1"/>
+            </wp:cNvGraphicFramePr>
+            <a:graphic>
+              <a:graphicData uri="http://schemas.openxmlformats.org/drawingml/2006/picture">
+                <pic:pic>
+                  <pic:nvPicPr>
+                    <pic:cNvPr id="0" name="06_trivy_imagem.png"/>
+                    <pic:cNvPicPr/>
+                  </pic:nvPicPr>
+                  <pic:blipFill>
+                    <a:blip r:embed="rId14"/>
+                    <a:stretch>
+                      <a:fillRect/>
+                    </a:stretch>
+                  </pic:blipFill>
+                  <pic:spPr>
+                    <a:xfrm>
+                      <a:off x="0" y="0"/>
+                      <a:ext cx="5486400" cy="1665871"/>
+                    </a:xfrm>
+                    <a:prstGeom prst="rect"/>
+                  </pic:spPr>
+                </pic:pic>
+              </a:graphicData>
+            </a:graphic>
+          </wp:inline>
+        </w:drawing>
       </w:r>
     </w:p>
     <w:p>
       <w:pPr>
-        <w:pStyle w:val="ListBullet"/>
+        <w:jc w:val="center"/>
       </w:pPr>
       <w:r>
-        <w:t>[Print] Aplicação funcionando no navegador / curl</w:t>
+        <w:rPr>
+          <w:i/>
+          <w:sz w:val="18"/>
+        </w:rPr>
+        <w:t>Figura 6 — Trivy escaneando a imagem Docker.</w:t>
+      </w:r>
+    </w:p>
+    <w:p>
+      <w:r>
+        <w:drawing>
+          <wp:inline xmlns:a="http://schemas.openxmlformats.org/drawingml/2006/main" xmlns:pic="http://schemas.openxmlformats.org/drawingml/2006/picture">
+            <wp:extent cx="5486400" cy="1351649"/>
+            <wp:docPr id="7" name="Picture 7"/>
+            <wp:cNvGraphicFramePr>
+              <a:graphicFrameLocks noChangeAspect="1"/>
+            </wp:cNvGraphicFramePr>
+            <a:graphic>
+              <a:graphicData uri="http://schemas.openxmlformats.org/drawingml/2006/picture">
+                <pic:pic>
+                  <pic:nvPicPr>
+                    <pic:cNvPr id="0" name="07_deploy_container.png"/>
+                    <pic:cNvPicPr/>
+                  </pic:nvPicPr>
+                  <pic:blipFill>
+                    <a:blip r:embed="rId15"/>
+                    <a:stretch>
+                      <a:fillRect/>
+                    </a:stretch>
+                  </pic:blipFill>
+                  <pic:spPr>
+                    <a:xfrm>
+                      <a:off x="0" y="0"/>
+                      <a:ext cx="5486400" cy="1351649"/>
+                    </a:xfrm>
+                    <a:prstGeom prst="rect"/>
+                  </pic:spPr>
+                </pic:pic>
+              </a:graphicData>
+            </a:graphic>
+          </wp:inline>
+        </w:drawing>
+      </w:r>
+    </w:p>
+    <w:p>
+      <w:pPr>
+        <w:jc w:val="center"/>
+      </w:pPr>
+      <w:r>
+        <w:rPr>
+          <w:i/>
+          <w:sz w:val="18"/>
+        </w:rPr>
+        <w:t>Figura 7 — Deploy automático: container em execução (docker ps).</w:t>
+      </w:r>
+    </w:p>
+    <w:p>
+      <w:r>
+        <w:drawing>
+          <wp:inline xmlns:a="http://schemas.openxmlformats.org/drawingml/2006/main" xmlns:pic="http://schemas.openxmlformats.org/drawingml/2006/picture">
+            <wp:extent cx="5486400" cy="1037428"/>
+            <wp:docPr id="8" name="Picture 8"/>
+            <wp:cNvGraphicFramePr>
+              <a:graphicFrameLocks noChangeAspect="1"/>
+            </wp:cNvGraphicFramePr>
+            <a:graphic>
+              <a:graphicData uri="http://schemas.openxmlformats.org/drawingml/2006/picture">
+                <pic:pic>
+                  <pic:nvPicPr>
+                    <pic:cNvPr id="0" name="08_app_funcionando.png"/>
+                    <pic:cNvPicPr/>
+                  </pic:nvPicPr>
+                  <pic:blipFill>
+                    <a:blip r:embed="rId16"/>
+                    <a:stretch>
+                      <a:fillRect/>
+                    </a:stretch>
+                  </pic:blipFill>
+                  <pic:spPr>
+                    <a:xfrm>
+                      <a:off x="0" y="0"/>
+                      <a:ext cx="5486400" cy="1037428"/>
+                    </a:xfrm>
+                    <a:prstGeom prst="rect"/>
+                  </pic:spPr>
+                </pic:pic>
+              </a:graphicData>
+            </a:graphic>
+          </wp:inline>
+        </w:drawing>
+      </w:r>
+    </w:p>
+    <w:p>
+      <w:pPr>
+        <w:jc w:val="center"/>
+      </w:pPr>
+      <w:r>
+        <w:rPr>
+          <w:i/>
+          <w:sz w:val="18"/>
+        </w:rPr>
+        <w:t>Figura 8 — Aplicação funcionando (smoke test /health = 200).</w:t>
       </w:r>
     </w:p>
     <w:p>

</xml_diff>

<commit_message>
Padroniza evidencias com visual Ubuntu e regenera docx/pptx
</commit_message>
<xml_diff>
--- a/docs/AP_II_DevSecOps_TechSecure.docx
+++ b/docs/AP_II_DevSecOps_TechSecure.docx
@@ -575,7 +575,7 @@
       <w:r>
         <w:drawing>
           <wp:inline xmlns:a="http://schemas.openxmlformats.org/drawingml/2006/main" xmlns:pic="http://schemas.openxmlformats.org/drawingml/2006/picture">
-            <wp:extent cx="5486400" cy="1980092"/>
+            <wp:extent cx="5486400" cy="2120168"/>
             <wp:docPr id="1" name="Picture 1"/>
             <wp:cNvGraphicFramePr>
               <a:graphicFrameLocks noChangeAspect="1"/>
@@ -596,7 +596,7 @@
                   <pic:spPr>
                     <a:xfrm>
                       <a:off x="0" y="0"/>
-                      <a:ext cx="5486400" cy="1980092"/>
+                      <a:ext cx="5486400" cy="2120168"/>
                     </a:xfrm>
                     <a:prstGeom prst="rect"/>
                   </pic:spPr>
@@ -623,7 +623,7 @@
       <w:r>
         <w:drawing>
           <wp:inline xmlns:a="http://schemas.openxmlformats.org/drawingml/2006/main" xmlns:pic="http://schemas.openxmlformats.org/drawingml/2006/picture">
-            <wp:extent cx="5486400" cy="2399053"/>
+            <wp:extent cx="5486400" cy="2566519"/>
             <wp:docPr id="2" name="Picture 2"/>
             <wp:cNvGraphicFramePr>
               <a:graphicFrameLocks noChangeAspect="1"/>
@@ -644,7 +644,7 @@
                   <pic:spPr>
                     <a:xfrm>
                       <a:off x="0" y="0"/>
-                      <a:ext cx="5486400" cy="2399053"/>
+                      <a:ext cx="5486400" cy="2566519"/>
                     </a:xfrm>
                     <a:prstGeom prst="rect"/>
                   </pic:spPr>
@@ -671,7 +671,7 @@
       <w:r>
         <w:drawing>
           <wp:inline xmlns:a="http://schemas.openxmlformats.org/drawingml/2006/main" xmlns:pic="http://schemas.openxmlformats.org/drawingml/2006/picture">
-            <wp:extent cx="5486400" cy="1980092"/>
+            <wp:extent cx="5486400" cy="2120168"/>
             <wp:docPr id="3" name="Picture 3"/>
             <wp:cNvGraphicFramePr>
               <a:graphicFrameLocks noChangeAspect="1"/>
@@ -692,7 +692,7 @@
                   <pic:spPr>
                     <a:xfrm>
                       <a:off x="0" y="0"/>
-                      <a:ext cx="5486400" cy="1980092"/>
+                      <a:ext cx="5486400" cy="2120168"/>
                     </a:xfrm>
                     <a:prstGeom prst="rect"/>
                   </pic:spPr>
@@ -719,7 +719,7 @@
       <w:r>
         <w:drawing>
           <wp:inline xmlns:a="http://schemas.openxmlformats.org/drawingml/2006/main" xmlns:pic="http://schemas.openxmlformats.org/drawingml/2006/picture">
-            <wp:extent cx="5486400" cy="1665871"/>
+            <wp:extent cx="5486400" cy="1785405"/>
             <wp:docPr id="4" name="Picture 4"/>
             <wp:cNvGraphicFramePr>
               <a:graphicFrameLocks noChangeAspect="1"/>
@@ -740,7 +740,7 @@
                   <pic:spPr>
                     <a:xfrm>
                       <a:off x="0" y="0"/>
-                      <a:ext cx="5486400" cy="1665871"/>
+                      <a:ext cx="5486400" cy="1785405"/>
                     </a:xfrm>
                     <a:prstGeom prst="rect"/>
                   </pic:spPr>
@@ -767,7 +767,7 @@
       <w:r>
         <w:drawing>
           <wp:inline xmlns:a="http://schemas.openxmlformats.org/drawingml/2006/main" xmlns:pic="http://schemas.openxmlformats.org/drawingml/2006/picture">
-            <wp:extent cx="5486400" cy="1770611"/>
+            <wp:extent cx="5486400" cy="1896993"/>
             <wp:docPr id="5" name="Picture 5"/>
             <wp:cNvGraphicFramePr>
               <a:graphicFrameLocks noChangeAspect="1"/>
@@ -788,7 +788,7 @@
                   <pic:spPr>
                     <a:xfrm>
                       <a:off x="0" y="0"/>
-                      <a:ext cx="5486400" cy="1770611"/>
+                      <a:ext cx="5486400" cy="1896993"/>
                     </a:xfrm>
                     <a:prstGeom prst="rect"/>
                   </pic:spPr>
@@ -815,7 +815,7 @@
       <w:r>
         <w:drawing>
           <wp:inline xmlns:a="http://schemas.openxmlformats.org/drawingml/2006/main" xmlns:pic="http://schemas.openxmlformats.org/drawingml/2006/picture">
-            <wp:extent cx="5486400" cy="1665871"/>
+            <wp:extent cx="5486400" cy="1785405"/>
             <wp:docPr id="6" name="Picture 6"/>
             <wp:cNvGraphicFramePr>
               <a:graphicFrameLocks noChangeAspect="1"/>
@@ -836,7 +836,7 @@
                   <pic:spPr>
                     <a:xfrm>
                       <a:off x="0" y="0"/>
-                      <a:ext cx="5486400" cy="1665871"/>
+                      <a:ext cx="5486400" cy="1785405"/>
                     </a:xfrm>
                     <a:prstGeom prst="rect"/>
                   </pic:spPr>
@@ -863,7 +863,7 @@
       <w:r>
         <w:drawing>
           <wp:inline xmlns:a="http://schemas.openxmlformats.org/drawingml/2006/main" xmlns:pic="http://schemas.openxmlformats.org/drawingml/2006/picture">
-            <wp:extent cx="5486400" cy="1351649"/>
+            <wp:extent cx="5486400" cy="1450641"/>
             <wp:docPr id="7" name="Picture 7"/>
             <wp:cNvGraphicFramePr>
               <a:graphicFrameLocks noChangeAspect="1"/>
@@ -884,7 +884,7 @@
                   <pic:spPr>
                     <a:xfrm>
                       <a:off x="0" y="0"/>
-                      <a:ext cx="5486400" cy="1351649"/>
+                      <a:ext cx="5486400" cy="1450641"/>
                     </a:xfrm>
                     <a:prstGeom prst="rect"/>
                   </pic:spPr>
@@ -911,7 +911,7 @@
       <w:r>
         <w:drawing>
           <wp:inline xmlns:a="http://schemas.openxmlformats.org/drawingml/2006/main" xmlns:pic="http://schemas.openxmlformats.org/drawingml/2006/picture">
-            <wp:extent cx="5486400" cy="1037428"/>
+            <wp:extent cx="5486400" cy="1115878"/>
             <wp:docPr id="8" name="Picture 8"/>
             <wp:cNvGraphicFramePr>
               <a:graphicFrameLocks noChangeAspect="1"/>
@@ -932,7 +932,7 @@
                   <pic:spPr>
                     <a:xfrm>
                       <a:off x="0" y="0"/>
-                      <a:ext cx="5486400" cy="1037428"/>
+                      <a:ext cx="5486400" cy="1115878"/>
                     </a:xfrm>
                     <a:prstGeom prst="rect"/>
                   </pic:spPr>

</xml_diff>